<commit_message>
docs: record reception demo acceptance checkpoint
</commit_message>
<xml_diff>
--- a/reports/weekly-milestones/Toolkit_Weekly_Milestone_13_Reception_Integration_and_Deployment_Readiness_31_July_2026.docx
+++ b/reports/weekly-milestones/Toolkit_Weekly_Milestone_13_Reception_Integration_and_Deployment_Readiness_31_July_2026.docx
@@ -1062,7 +1062,7 @@
         <w:pStyle w:val="ListBullet"/>
       </w:pPr>
       <w:r>
-        <w:t>The demo currently returns HTTP 500 and is not accepted because private environment, database, migrations and runtime permissions remain incomplete.</w:t>
+        <w:t>The demo now returns HTTP 200 and is ready for acceptance after private environment, database, migrations, seed, runtime and cache completion.</w:t>
       </w:r>
     </w:p>
     <w:p>
@@ -1070,7 +1070,7 @@
         <w:pStyle w:val="ListBullet"/>
       </w:pPr>
       <w:r>
-        <w:t>The reception form and redesigned image/video gallery templates are local-only and have not been deployed to demo.</w:t>
+        <w:t>The reception form and redesigned image/video gallery templates are deployed and visually verified on demo.</w:t>
       </w:r>
     </w:p>
     <w:p>
@@ -1078,7 +1078,7 @@
         <w:pStyle w:val="ListBullet"/>
       </w:pPr>
       <w:r>
-        <w:t>No persistent local browser-review server or locally reviewable form exists.</w:t>
+        <w:t>The demo URLs are the current browser-review environment; no persistent local server is required.</w:t>
       </w:r>
     </w:p>
     <w:p>
@@ -1086,7 +1086,7 @@
         <w:pStyle w:val="ListBullet"/>
       </w:pPr>
       <w:r>
-        <w:t>Production remains unchanged apart from empty independent directory creation.</w:t>
+        <w:t>Production remains unchanged and gated on explicit demo acceptance.</w:t>
       </w:r>
     </w:p>
     <w:p>
@@ -1164,6 +1164,275 @@
       </w:pPr>
       <w:r>
         <w:t>If any gate remains unmet, the milestone records a hold rather than claiming deployment completion.</w:t>
+      </w:r>
+    </w:p>
+    <w:p>
+      <w:pPr>
+        <w:pStyle w:val="Heading1"/>
+      </w:pPr>
+      <w:r>
+        <w:t>Demo deployment checkpoint — 28 July 2026</w:t>
+      </w:r>
+    </w:p>
+    <w:p>
+      <w:r>
+        <w:t>Status: demo operational and ready for user acceptance; production remains on hold pending explicit approval.</w:t>
+      </w:r>
+    </w:p>
+    <w:tbl>
+      <w:tblPr>
+        <w:tblStyle w:val="TableGrid"/>
+        <w:tblW w:type="auto" w:w="0"/>
+        <w:tblLook w:firstColumn="1" w:firstRow="1" w:lastColumn="0" w:lastRow="0" w:noHBand="0" w:noVBand="1" w:val="04A0"/>
+      </w:tblPr>
+      <w:tblGrid>
+        <w:gridCol w:w="5112"/>
+        <w:gridCol w:w="5112"/>
+      </w:tblGrid>
+      <w:tr>
+        <w:tc>
+          <w:tcPr>
+            <w:tcW w:type="dxa" w:w="5112"/>
+          </w:tcPr>
+          <w:p>
+            <w:r>
+              <w:t>Checkpoint</w:t>
+            </w:r>
+          </w:p>
+        </w:tc>
+        <w:tc>
+          <w:tcPr>
+            <w:tcW w:type="dxa" w:w="5112"/>
+          </w:tcPr>
+          <w:p>
+            <w:r>
+              <w:t>Evidence</w:t>
+            </w:r>
+          </w:p>
+        </w:tc>
+      </w:tr>
+      <w:tr>
+        <w:tc>
+          <w:tcPr>
+            <w:tcW w:type="dxa" w:w="5112"/>
+          </w:tcPr>
+          <w:p>
+            <w:r>
+              <w:t>Reception runtime</w:t>
+            </w:r>
+          </w:p>
+        </w:tc>
+        <w:tc>
+          <w:tcPr>
+            <w:tcW w:type="dxa" w:w="5112"/>
+          </w:tcPr>
+          <w:p>
+            <w:r>
+              <w:t>Dedicated demo database/user, private environment, migrations, seed and caches completed.</w:t>
+            </w:r>
+          </w:p>
+        </w:tc>
+      </w:tr>
+      <w:tr>
+        <w:tc>
+          <w:tcPr>
+            <w:tcW w:type="dxa" w:w="5112"/>
+          </w:tcPr>
+          <w:p>
+            <w:r>
+              <w:t>Backend validation</w:t>
+            </w:r>
+          </w:p>
+        </w:tc>
+        <w:tc>
+          <w:tcPr>
+            <w:tcW w:type="dxa" w:w="5112"/>
+          </w:tcPr>
+          <w:p>
+            <w:r>
+              <w:t>Public/login HTTP 200; valid signed request HTTP 201; invalid signature HTTP 401.</w:t>
+            </w:r>
+          </w:p>
+        </w:tc>
+      </w:tr>
+      <w:tr>
+        <w:tc>
+          <w:tcPr>
+            <w:tcW w:type="dxa" w:w="5112"/>
+          </w:tcPr>
+          <w:p>
+            <w:r>
+              <w:t>Website relay</w:t>
+            </w:r>
+          </w:p>
+        </w:tc>
+        <w:tc>
+          <w:tcPr>
+            <w:tcW w:type="dxa" w:w="5112"/>
+          </w:tcPr>
+          <w:p>
+            <w:r>
+              <w:t>WordPress demo returned a WEB reference and the follow-up appeared in Reception Control.</w:t>
+            </w:r>
+          </w:p>
+        </w:tc>
+      </w:tr>
+      <w:tr>
+        <w:tc>
+          <w:tcPr>
+            <w:tcW w:type="dxa" w:w="5112"/>
+          </w:tcPr>
+          <w:p>
+            <w:r>
+              <w:t>Public experience</w:t>
+            </w:r>
+          </w:p>
+        </w:tc>
+        <w:tc>
+          <w:tcPr>
+            <w:tcW w:type="dxa" w:w="5112"/>
+          </w:tcPr>
+          <w:p>
+            <w:r>
+              <w:t>Reception form and redesigned image/video galleries are live on demo.</w:t>
+            </w:r>
+          </w:p>
+        </w:tc>
+      </w:tr>
+      <w:tr>
+        <w:tc>
+          <w:tcPr>
+            <w:tcW w:type="dxa" w:w="5112"/>
+          </w:tcPr>
+          <w:p>
+            <w:r>
+              <w:t>Security cleanup</w:t>
+            </w:r>
+          </w:p>
+        </w:tc>
+        <w:tc>
+          <w:tcPr>
+            <w:tcW w:type="dxa" w:w="5112"/>
+          </w:tcPr>
+          <w:p>
+            <w:r>
+              <w:t>One-time setup runner removed and confirmed HTTP 404; secrets excluded from Git/report.</w:t>
+            </w:r>
+          </w:p>
+        </w:tc>
+      </w:tr>
+      <w:tr>
+        <w:tc>
+          <w:tcPr>
+            <w:tcW w:type="dxa" w:w="5112"/>
+          </w:tcPr>
+          <w:p>
+            <w:r>
+              <w:t>Git</w:t>
+            </w:r>
+          </w:p>
+        </w:tc>
+        <w:tc>
+          <w:tcPr>
+            <w:tcW w:type="dxa" w:w="5112"/>
+          </w:tcPr>
+          <w:p>
+            <w:r>
+              <w:t>Reception 7ed75ae and f16790c; WordPress 34ce395 and 7b08ae7.</w:t>
+            </w:r>
+          </w:p>
+        </w:tc>
+      </w:tr>
+      <w:tr>
+        <w:tc>
+          <w:tcPr>
+            <w:tcW w:type="dxa" w:w="5112"/>
+          </w:tcPr>
+          <w:p>
+            <w:r>
+              <w:t>Visual evidence</w:t>
+            </w:r>
+          </w:p>
+        </w:tc>
+        <w:tc>
+          <w:tcPr>
+            <w:tcW w:type="dxa" w:w="5112"/>
+          </w:tcPr>
+          <w:p>
+            <w:r>
+              <w:t>reports/deployment-evidence/2026-07-28/</w:t>
+            </w:r>
+          </w:p>
+        </w:tc>
+      </w:tr>
+    </w:tbl>
+    <w:p>
+      <w:pPr>
+        <w:pStyle w:val="Heading2"/>
+      </w:pPr>
+      <w:r>
+        <w:t>Acceptance and remaining scope</w:t>
+      </w:r>
+    </w:p>
+    <w:p>
+      <w:pPr>
+        <w:pStyle w:val="ListBullet"/>
+      </w:pPr>
+      <w:r>
+        <w:t>User and reception owner review the four demo URLs on desktop and mobile.</w:t>
+      </w:r>
+    </w:p>
+    <w:p>
+      <w:pPr>
+        <w:pStyle w:val="ListBullet"/>
+      </w:pPr>
+      <w:r>
+        <w:t>Confirm wording, purposes, staff workflow, retention owner and backup schedule.</w:t>
+      </w:r>
+    </w:p>
+    <w:p>
+      <w:pPr>
+        <w:pStyle w:val="ListBullet"/>
+      </w:pPr>
+      <w:r>
+        <w:t>Delete the two clearly labelled demo verification records after acceptance.</w:t>
+      </w:r>
+    </w:p>
+    <w:p>
+      <w:pPr>
+        <w:pStyle w:val="ListBullet"/>
+      </w:pPr>
+      <w:r>
+        <w:t>Rehearse rollback and record the result.</w:t>
+      </w:r>
+    </w:p>
+    <w:p>
+      <w:pPr>
+        <w:pStyle w:val="ListBullet"/>
+      </w:pPr>
+      <w:r>
+        <w:t>Create fresh production-only database, HMAC and administrator secrets.</w:t>
+      </w:r>
+    </w:p>
+    <w:p>
+      <w:pPr>
+        <w:pStyle w:val="ListBullet"/>
+      </w:pPr>
+      <w:r>
+        <w:t>Take same-day production backups and deploy backend before enabling WordPress.</w:t>
+      </w:r>
+    </w:p>
+    <w:p>
+      <w:pPr>
+        <w:pStyle w:val="ListBullet"/>
+      </w:pPr>
+      <w:r>
+        <w:t>Run production smoke tests, remove test data, monitor and rotate cPanel credentials.</w:t>
+      </w:r>
+    </w:p>
+    <w:p>
+      <w:r>
+        <w:t>No production application, database or public page was changed during this demo checkpoint.</w:t>
       </w:r>
     </w:p>
     <w:sectPr>
@@ -1596,6 +1865,9 @@
       </w:tabs>
       <w:spacing w:after="0" w:line="240" w:lineRule="auto"/>
     </w:pPr>
+    <w:rPr>
+      <w:sz w:val="18"/>
+    </w:rPr>
   </w:style>
   <w:style w:type="character" w:customStyle="1" w:styleId="HeaderChar">
     <w:name w:val="Header Char"/>

</xml_diff>

<commit_message>
feat: reimagine media galleries and fix cache releases
</commit_message>
<xml_diff>
--- a/reports/weekly-milestones/Toolkit_Weekly_Milestone_13_Reception_Integration_and_Deployment_Readiness_31_July_2026.docx
+++ b/reports/weekly-milestones/Toolkit_Weekly_Milestone_13_Reception_Integration_and_Deployment_Readiness_31_July_2026.docx
@@ -1435,6 +1435,189 @@
         <w:t>No production application, database or public page was changed during this demo checkpoint.</w:t>
       </w:r>
     </w:p>
+    <w:p>
+      <w:pPr>
+        <w:pStyle w:val="Heading1"/>
+      </w:pPr>
+      <w:r>
+        <w:t>Gallery and cache delivery iteration — 28 July 2026</w:t>
+      </w:r>
+    </w:p>
+    <w:p>
+      <w:r>
+        <w:t>The image and video galleries were redesigned as intentionally different Gen Z-facing experiences and deployed to demo. Production remains unchanged.</w:t>
+      </w:r>
+    </w:p>
+    <w:tbl>
+      <w:tblPr>
+        <w:tblStyle w:val="TableGrid"/>
+        <w:tblW w:type="auto" w:w="0"/>
+        <w:tblLook w:firstColumn="1" w:firstRow="1" w:lastColumn="0" w:lastRow="0" w:noHBand="0" w:noVBand="1" w:val="04A0"/>
+      </w:tblPr>
+      <w:tblGrid>
+        <w:gridCol w:w="5112"/>
+        <w:gridCol w:w="5112"/>
+      </w:tblGrid>
+      <w:tr>
+        <w:tc>
+          <w:tcPr>
+            <w:tcW w:type="dxa" w:w="5112"/>
+          </w:tcPr>
+          <w:p>
+            <w:r>
+              <w:t>Area</w:t>
+            </w:r>
+          </w:p>
+        </w:tc>
+        <w:tc>
+          <w:tcPr>
+            <w:tcW w:type="dxa" w:w="5112"/>
+          </w:tcPr>
+          <w:p>
+            <w:r>
+              <w:t>Completed evidence</w:t>
+            </w:r>
+          </w:p>
+        </w:tc>
+      </w:tr>
+      <w:tr>
+        <w:tc>
+          <w:tcPr>
+            <w:tcW w:type="dxa" w:w="5112"/>
+          </w:tcPr>
+          <w:p>
+            <w:r>
+              <w:t>Image gallery</w:t>
+            </w:r>
+          </w:p>
+        </w:tc>
+        <w:tc>
+          <w:tcPr>
+            <w:tcW w:type="dxa" w:w="5112"/>
+          </w:tcPr>
+          <w:p>
+            <w:r>
+              <w:t>Editorial photo-zine layout, asymmetric collage, captions, stickers and accessible lightbox.</w:t>
+            </w:r>
+          </w:p>
+        </w:tc>
+      </w:tr>
+      <w:tr>
+        <w:tc>
+          <w:tcPr>
+            <w:tcW w:type="dxa" w:w="5112"/>
+          </w:tcPr>
+          <w:p>
+            <w:r>
+              <w:t>Video gallery</w:t>
+            </w:r>
+          </w:p>
+        </w:tc>
+        <w:tc>
+          <w:tcPr>
+            <w:tcW w:type="dxa" w:w="5112"/>
+          </w:tcPr>
+          <w:p>
+            <w:r>
+              <w:t>Independent dark watch-room theme with live-channel hero, neon treatment and numbered episodes.</w:t>
+            </w:r>
+          </w:p>
+        </w:tc>
+      </w:tr>
+      <w:tr>
+        <w:tc>
+          <w:tcPr>
+            <w:tcW w:type="dxa" w:w="5112"/>
+          </w:tcPr>
+          <w:p>
+            <w:r>
+              <w:t>Cache defect</w:t>
+            </w:r>
+          </w:p>
+        </w:tc>
+        <w:tc>
+          <w:tcPr>
+            <w:tcW w:type="dxa" w:w="5112"/>
+          </w:tcPr>
+          <w:p>
+            <w:r>
+              <w:t>Legacy filters stripping WordPress asset version keys were identified and removed.</w:t>
+            </w:r>
+          </w:p>
+        </w:tc>
+      </w:tr>
+      <w:tr>
+        <w:tc>
+          <w:tcPr>
+            <w:tcW w:type="dxa" w:w="5112"/>
+          </w:tcPr>
+          <w:p>
+            <w:r>
+              <w:t>Release control</w:t>
+            </w:r>
+          </w:p>
+        </w:tc>
+        <w:tc>
+          <w:tcPr>
+            <w:tcW w:type="dxa" w:w="5112"/>
+          </w:tcPr>
+          <w:p>
+            <w:r>
+              <w:t>Release 2026.07.28.4 combines release and file-time cache keys and triggers one LiteSpeed/object-cache purge.</w:t>
+            </w:r>
+          </w:p>
+        </w:tc>
+      </w:tr>
+      <w:tr>
+        <w:tc>
+          <w:tcPr>
+            <w:tcW w:type="dxa" w:w="5112"/>
+          </w:tcPr>
+          <w:p>
+            <w:r>
+              <w:t>Remote verification</w:t>
+            </w:r>
+          </w:p>
+        </w:tc>
+        <w:tc>
+          <w:tcPr>
+            <w:tcW w:type="dxa" w:w="5112"/>
+          </w:tcPr>
+          <w:p>
+            <w:r>
+              <w:t>Versioned CSS/JavaScript URLs, X-Toolkit-Release 2026.07.28.4 and LiteSpeed cache miss confirmed.</w:t>
+            </w:r>
+          </w:p>
+        </w:tc>
+      </w:tr>
+      <w:tr>
+        <w:tc>
+          <w:tcPr>
+            <w:tcW w:type="dxa" w:w="5112"/>
+          </w:tcPr>
+          <w:p>
+            <w:r>
+              <w:t>Evidence</w:t>
+            </w:r>
+          </w:p>
+        </w:tc>
+        <w:tc>
+          <w:tcPr>
+            <w:tcW w:type="dxa" w:w="5112"/>
+          </w:tcPr>
+          <w:p>
+            <w:r>
+              <w:t>Updated Gen Z gallery screenshots saved under reports/deployment-evidence/2026-07-28/.</w:t>
+            </w:r>
+          </w:p>
+        </w:tc>
+      </w:tr>
+    </w:tbl>
+    <w:p>
+      <w:r>
+        <w:t>Operational rule: increment the theme release for every public change, deploy assets before functions.php, trigger one uncached request and verify the release header, versioned URLs and cache miss.</w:t>
+      </w:r>
+    </w:p>
     <w:sectPr>
       <w:headerReference w:type="default" r:id="rId9"/>
       <w:footerReference w:type="default" r:id="rId10"/>

</xml_diff>

<commit_message>
feat: deliver approved brand gallery journeys
</commit_message>
<xml_diff>
--- a/reports/weekly-milestones/Toolkit_Weekly_Milestone_13_Reception_Integration_and_Deployment_Readiness_31_July_2026.docx
+++ b/reports/weekly-milestones/Toolkit_Weekly_Milestone_13_Reception_Integration_and_Deployment_Readiness_31_July_2026.docx
@@ -1618,6 +1618,184 @@
         <w:t>Operational rule: increment the theme release for every public change, deploy assets before functions.php, trigger one uncached request and verify the release header, versioned URLs and cache miss.</w:t>
       </w:r>
     </w:p>
+    <w:p>
+      <w:pPr>
+        <w:pStyle w:val="Heading1"/>
+      </w:pPr>
+      <w:r>
+        <w:t>Approved gallery release — 28 July 2026</w:t>
+      </w:r>
+    </w:p>
+    <w:p>
+      <w:r>
+        <w:t>Following local stakeholder review, the replacement gallery experience was deployed to demo as release 2026.07.28.6. Production remains unchanged.</w:t>
+      </w:r>
+    </w:p>
+    <w:tbl>
+      <w:tblPr>
+        <w:tblStyle w:val="TableGrid"/>
+        <w:tblW w:type="auto" w:w="0"/>
+        <w:tblLook w:firstColumn="1" w:firstRow="1" w:lastColumn="0" w:lastRow="0" w:noHBand="0" w:noVBand="1" w:val="04A0"/>
+      </w:tblPr>
+      <w:tblGrid>
+        <w:gridCol w:w="5112"/>
+        <w:gridCol w:w="5112"/>
+      </w:tblGrid>
+      <w:tr>
+        <w:tc>
+          <w:tcPr>
+            <w:tcW w:type="dxa" w:w="5112"/>
+          </w:tcPr>
+          <w:p>
+            <w:r>
+              <w:t>Area</w:t>
+            </w:r>
+          </w:p>
+        </w:tc>
+        <w:tc>
+          <w:tcPr>
+            <w:tcW w:type="dxa" w:w="5112"/>
+          </w:tcPr>
+          <w:p>
+            <w:r>
+              <w:t>Accepted result</w:t>
+            </w:r>
+          </w:p>
+        </w:tc>
+      </w:tr>
+      <w:tr>
+        <w:tc>
+          <w:tcPr>
+            <w:tcW w:type="dxa" w:w="5112"/>
+          </w:tcPr>
+          <w:p>
+            <w:r>
+              <w:t>Image gallery</w:t>
+            </w:r>
+          </w:p>
+        </w:tc>
+        <w:tc>
+          <w:tcPr>
+            <w:tcW w:type="dxa" w:w="5112"/>
+          </w:tcPr>
+          <w:p>
+            <w:r>
+              <w:t>Vintage pinned journey wall with field notes, numbered stops, guide path and accessible lightbox.</w:t>
+            </w:r>
+          </w:p>
+        </w:tc>
+      </w:tr>
+      <w:tr>
+        <w:tc>
+          <w:tcPr>
+            <w:tcW w:type="dxa" w:w="5112"/>
+          </w:tcPr>
+          <w:p>
+            <w:r>
+              <w:t>Video gallery</w:t>
+            </w:r>
+          </w:p>
+        </w:tc>
+        <w:tc>
+          <w:tcPr>
+            <w:tcW w:type="dxa" w:w="5112"/>
+          </w:tcPr>
+          <w:p>
+            <w:r>
+              <w:t>One primary 16:9 player, six thumbnail playlist choices, active episode state and native YouTube controls.</w:t>
+            </w:r>
+          </w:p>
+        </w:tc>
+      </w:tr>
+      <w:tr>
+        <w:tc>
+          <w:tcPr>
+            <w:tcW w:type="dxa" w:w="5112"/>
+          </w:tcPr>
+          <w:p>
+            <w:r>
+              <w:t>Hero refinement</w:t>
+            </w:r>
+          </w:p>
+        </w:tc>
+        <w:tc>
+          <w:tcPr>
+            <w:tcW w:type="dxa" w:w="5112"/>
+          </w:tcPr>
+          <w:p>
+            <w:r>
+              <w:t>Forced minimum height removed and vertical padding reduced so the player enters the first viewport.</w:t>
+            </w:r>
+          </w:p>
+        </w:tc>
+      </w:tr>
+      <w:tr>
+        <w:tc>
+          <w:tcPr>
+            <w:tcW w:type="dxa" w:w="5112"/>
+          </w:tcPr>
+          <w:p>
+            <w:r>
+              <w:t>Brand integration</w:t>
+            </w:r>
+          </w:p>
+        </w:tc>
+        <w:tc>
+          <w:tcPr>
+            <w:tcW w:type="dxa" w:w="5112"/>
+          </w:tcPr>
+          <w:p>
+            <w:r>
+              <w:t>Orange, olive, peach, neutral and dark Toolkit tokens used; conflicting global button styling corrected.</w:t>
+            </w:r>
+          </w:p>
+        </w:tc>
+      </w:tr>
+      <w:tr>
+        <w:tc>
+          <w:tcPr>
+            <w:tcW w:type="dxa" w:w="5112"/>
+          </w:tcPr>
+          <w:p>
+            <w:r>
+              <w:t>Site chrome</w:t>
+            </w:r>
+          </w:p>
+        </w:tc>
+        <w:tc>
+          <w:tcPr>
+            <w:tcW w:type="dxa" w:w="5112"/>
+          </w:tcPr>
+          <w:p>
+            <w:r>
+              <w:t>Complete Toolkit header and footer confirmed on both demo gallery routes.</w:t>
+            </w:r>
+          </w:p>
+        </w:tc>
+      </w:tr>
+      <w:tr>
+        <w:tc>
+          <w:tcPr>
+            <w:tcW w:type="dxa" w:w="5112"/>
+          </w:tcPr>
+          <w:p>
+            <w:r>
+              <w:t>Cache/evidence</w:t>
+            </w:r>
+          </w:p>
+        </w:tc>
+        <w:tc>
+          <w:tcPr>
+            <w:tcW w:type="dxa" w:w="5112"/>
+          </w:tcPr>
+          <w:p>
+            <w:r>
+              <w:t>Release header 2026.07.28.6, versioned assets, LiteSpeed miss and updated screenshots confirmed.</w:t>
+            </w:r>
+          </w:p>
+        </w:tc>
+      </w:tr>
+    </w:tbl>
     <w:sectPr>
       <w:headerReference w:type="default" r:id="rId9"/>
       <w:footerReference w:type="default" r:id="rId10"/>

</xml_diff>

<commit_message>
fix: respect viewer video caption settings
</commit_message>
<xml_diff>
--- a/reports/weekly-milestones/Toolkit_Weekly_Milestone_13_Reception_Integration_and_Deployment_Readiness_31_July_2026.docx
+++ b/reports/weekly-milestones/Toolkit_Weekly_Milestone_13_Reception_Integration_and_Deployment_Readiness_31_July_2026.docx
@@ -1796,6 +1796,162 @@
         </w:tc>
       </w:tr>
     </w:tbl>
+    <w:p>
+      <w:pPr>
+        <w:pStyle w:val="Heading1"/>
+      </w:pPr>
+      <w:r>
+        <w:t>Video caption correction — 28 July 2026</w:t>
+      </w:r>
+    </w:p>
+    <w:p>
+      <w:r>
+        <w:t>Demo review identified duplicated subtitles because the gallery explicitly forced YouTube captions through cc_load_policy=1. The parameter was removed from the initial embed, playlist-driven URLs and local review harness.</w:t>
+      </w:r>
+    </w:p>
+    <w:tbl>
+      <w:tblPr>
+        <w:tblStyle w:val="TableGrid"/>
+        <w:tblW w:type="auto" w:w="0"/>
+        <w:tblLook w:firstColumn="1" w:firstRow="1" w:lastColumn="0" w:lastRow="0" w:noHBand="0" w:noVBand="1" w:val="04A0"/>
+      </w:tblPr>
+      <w:tblGrid>
+        <w:gridCol w:w="5112"/>
+        <w:gridCol w:w="5112"/>
+      </w:tblGrid>
+      <w:tr>
+        <w:tc>
+          <w:tcPr>
+            <w:tcW w:type="dxa" w:w="5112"/>
+          </w:tcPr>
+          <w:p>
+            <w:r>
+              <w:t>Control</w:t>
+            </w:r>
+          </w:p>
+        </w:tc>
+        <w:tc>
+          <w:tcPr>
+            <w:tcW w:type="dxa" w:w="5112"/>
+          </w:tcPr>
+          <w:p>
+            <w:r>
+              <w:t>Result</w:t>
+            </w:r>
+          </w:p>
+        </w:tc>
+      </w:tr>
+      <w:tr>
+        <w:tc>
+          <w:tcPr>
+            <w:tcW w:type="dxa" w:w="5112"/>
+          </w:tcPr>
+          <w:p>
+            <w:r>
+              <w:t>Duplicate subtitle cause</w:t>
+            </w:r>
+          </w:p>
+        </w:tc>
+        <w:tc>
+          <w:tcPr>
+            <w:tcW w:type="dxa" w:w="5112"/>
+          </w:tcPr>
+          <w:p>
+            <w:r>
+              <w:t>Forced YouTube caption policy identified.</w:t>
+            </w:r>
+          </w:p>
+        </w:tc>
+      </w:tr>
+      <w:tr>
+        <w:tc>
+          <w:tcPr>
+            <w:tcW w:type="dxa" w:w="5112"/>
+          </w:tcPr>
+          <w:p>
+            <w:r>
+              <w:t>Correction</w:t>
+            </w:r>
+          </w:p>
+        </w:tc>
+        <w:tc>
+          <w:tcPr>
+            <w:tcW w:type="dxa" w:w="5112"/>
+          </w:tcPr>
+          <w:p>
+            <w:r>
+              <w:t>Forced policy removed; viewer caption preference restored.</w:t>
+            </w:r>
+          </w:p>
+        </w:tc>
+      </w:tr>
+      <w:tr>
+        <w:tc>
+          <w:tcPr>
+            <w:tcW w:type="dxa" w:w="5112"/>
+          </w:tcPr>
+          <w:p>
+            <w:r>
+              <w:t>Accessibility</w:t>
+            </w:r>
+          </w:p>
+        </w:tc>
+        <w:tc>
+          <w:tcPr>
+            <w:tcW w:type="dxa" w:w="5112"/>
+          </w:tcPr>
+          <w:p>
+            <w:r>
+              <w:t>Native YouTube caption control remains available.</w:t>
+            </w:r>
+          </w:p>
+        </w:tc>
+      </w:tr>
+      <w:tr>
+        <w:tc>
+          <w:tcPr>
+            <w:tcW w:type="dxa" w:w="5112"/>
+          </w:tcPr>
+          <w:p>
+            <w:r>
+              <w:t>Release</w:t>
+            </w:r>
+          </w:p>
+        </w:tc>
+        <w:tc>
+          <w:tcPr>
+            <w:tcW w:type="dxa" w:w="5112"/>
+          </w:tcPr>
+          <w:p>
+            <w:r>
+              <w:t>Demo cache release incremented to 2026.07.28.7.</w:t>
+            </w:r>
+          </w:p>
+        </w:tc>
+      </w:tr>
+      <w:tr>
+        <w:tc>
+          <w:tcPr>
+            <w:tcW w:type="dxa" w:w="5112"/>
+          </w:tcPr>
+          <w:p>
+            <w:r>
+              <w:t>Production</w:t>
+            </w:r>
+          </w:p>
+        </w:tc>
+        <w:tc>
+          <w:tcPr>
+            <w:tcW w:type="dxa" w:w="5112"/>
+          </w:tcPr>
+          <w:p>
+            <w:r>
+              <w:t>Unchanged and still separately approval-gated.</w:t>
+            </w:r>
+          </w:p>
+        </w:tc>
+      </w:tr>
+    </w:tbl>
     <w:sectPr>
       <w:headerReference w:type="default" r:id="rId9"/>
       <w:footerReference w:type="default" r:id="rId10"/>

</xml_diff>